<commit_message>
Actualización de documentación - Avance hasta paso 17.
Actualización de documentación - Avance hasta paso 17.
</commit_message>
<xml_diff>
--- a/ReservasSalasEnsayo/Evidencias Proyecto final.docx
+++ b/ReservasSalasEnsayo/Evidencias Proyecto final.docx
@@ -24,6 +24,9 @@
     </w:p>
     <w:p>
       <w:r>
+        <w:rPr>
+          <w:noProof/>
+        </w:rPr>
         <w:drawing>
           <wp:inline distT="0" distB="0" distL="0" distR="0" wp14:anchorId="57FE5BD2" wp14:editId="0CF7E589">
             <wp:extent cx="5612130" cy="2939415"/>
@@ -37,50 +40,6 @@
                 <pic:pic xmlns:pic="http://schemas.openxmlformats.org/drawingml/2006/picture">
                   <pic:nvPicPr>
                     <pic:cNvPr id="1252226103" name=""/>
-                    <pic:cNvPicPr/>
-                  </pic:nvPicPr>
-                  <pic:blipFill>
-                    <a:blip r:embed="rId4"/>
-                    <a:stretch>
-                      <a:fillRect/>
-                    </a:stretch>
-                  </pic:blipFill>
-                  <pic:spPr>
-                    <a:xfrm>
-                      <a:off x="0" y="0"/>
-                      <a:ext cx="5612130" cy="2939415"/>
-                    </a:xfrm>
-                    <a:prstGeom prst="rect">
-                      <a:avLst/>
-                    </a:prstGeom>
-                  </pic:spPr>
-                </pic:pic>
-              </a:graphicData>
-            </a:graphic>
-          </wp:inline>
-        </w:drawing>
-      </w:r>
-    </w:p>
-    <w:p>
-      <w:r>
-        <w:t>Creación de la Base de datos</w:t>
-      </w:r>
-    </w:p>
-    <w:p>
-      <w:r>
-        <w:drawing>
-          <wp:inline distT="0" distB="0" distL="0" distR="0" wp14:anchorId="69FD9DFE" wp14:editId="1964E2CC">
-            <wp:extent cx="5612130" cy="2939415"/>
-            <wp:effectExtent l="0" t="0" r="7620" b="0"/>
-            <wp:docPr id="1939876851" name="Imagen 1"/>
-            <wp:cNvGraphicFramePr>
-              <a:graphicFrameLocks xmlns:a="http://schemas.openxmlformats.org/drawingml/2006/main" noChangeAspect="1"/>
-            </wp:cNvGraphicFramePr>
-            <a:graphic xmlns:a="http://schemas.openxmlformats.org/drawingml/2006/main">
-              <a:graphicData uri="http://schemas.openxmlformats.org/drawingml/2006/picture">
-                <pic:pic xmlns:pic="http://schemas.openxmlformats.org/drawingml/2006/picture">
-                  <pic:nvPicPr>
-                    <pic:cNvPr id="1939876851" name=""/>
                     <pic:cNvPicPr/>
                   </pic:nvPicPr>
                   <pic:blipFill>
@@ -107,6 +66,53 @@
     </w:p>
     <w:p>
       <w:r>
+        <w:t>Creación de la Base de datos</w:t>
+      </w:r>
+    </w:p>
+    <w:p>
+      <w:r>
+        <w:rPr>
+          <w:noProof/>
+        </w:rPr>
+        <w:drawing>
+          <wp:inline distT="0" distB="0" distL="0" distR="0" wp14:anchorId="69FD9DFE" wp14:editId="1964E2CC">
+            <wp:extent cx="5612130" cy="2939415"/>
+            <wp:effectExtent l="0" t="0" r="7620" b="0"/>
+            <wp:docPr id="1939876851" name="Imagen 1"/>
+            <wp:cNvGraphicFramePr>
+              <a:graphicFrameLocks xmlns:a="http://schemas.openxmlformats.org/drawingml/2006/main" noChangeAspect="1"/>
+            </wp:cNvGraphicFramePr>
+            <a:graphic xmlns:a="http://schemas.openxmlformats.org/drawingml/2006/main">
+              <a:graphicData uri="http://schemas.openxmlformats.org/drawingml/2006/picture">
+                <pic:pic xmlns:pic="http://schemas.openxmlformats.org/drawingml/2006/picture">
+                  <pic:nvPicPr>
+                    <pic:cNvPr id="1939876851" name=""/>
+                    <pic:cNvPicPr/>
+                  </pic:nvPicPr>
+                  <pic:blipFill>
+                    <a:blip r:embed="rId6"/>
+                    <a:stretch>
+                      <a:fillRect/>
+                    </a:stretch>
+                  </pic:blipFill>
+                  <pic:spPr>
+                    <a:xfrm>
+                      <a:off x="0" y="0"/>
+                      <a:ext cx="5612130" cy="2939415"/>
+                    </a:xfrm>
+                    <a:prstGeom prst="rect">
+                      <a:avLst/>
+                    </a:prstGeom>
+                  </pic:spPr>
+                </pic:pic>
+              </a:graphicData>
+            </a:graphic>
+          </wp:inline>
+        </w:drawing>
+      </w:r>
+    </w:p>
+    <w:p>
+      <w:r>
         <w:br/>
       </w:r>
       <w:r>
@@ -143,6 +149,9 @@
     </w:p>
     <w:p>
       <w:r>
+        <w:rPr>
+          <w:noProof/>
+        </w:rPr>
         <w:drawing>
           <wp:inline distT="0" distB="0" distL="0" distR="0" wp14:anchorId="05C4FCA1" wp14:editId="413B86AE">
             <wp:extent cx="5612130" cy="2031365"/>
@@ -159,7 +168,7 @@
                     <pic:cNvPicPr/>
                   </pic:nvPicPr>
                   <pic:blipFill>
-                    <a:blip r:embed="rId6"/>
+                    <a:blip r:embed="rId7"/>
                     <a:stretch>
                       <a:fillRect/>
                     </a:stretch>
@@ -195,6 +204,9 @@
         <w:br/>
       </w:r>
       <w:r>
+        <w:rPr>
+          <w:noProof/>
+        </w:rPr>
         <w:drawing>
           <wp:inline distT="0" distB="0" distL="0" distR="0" wp14:anchorId="12014A05" wp14:editId="7938A884">
             <wp:extent cx="5612130" cy="2125980"/>
@@ -211,7 +223,7 @@
                     <pic:cNvPicPr/>
                   </pic:nvPicPr>
                   <pic:blipFill>
-                    <a:blip r:embed="rId7"/>
+                    <a:blip r:embed="rId8"/>
                     <a:stretch>
                       <a:fillRect/>
                     </a:stretch>
@@ -251,6 +263,9 @@
     </w:p>
     <w:p>
       <w:r>
+        <w:rPr>
+          <w:noProof/>
+        </w:rPr>
         <w:drawing>
           <wp:inline distT="0" distB="0" distL="0" distR="0" wp14:anchorId="67E18444" wp14:editId="5E56A6FC">
             <wp:extent cx="5612130" cy="1927860"/>
@@ -267,7 +282,7 @@
                     <pic:cNvPicPr/>
                   </pic:nvPicPr>
                   <pic:blipFill>
-                    <a:blip r:embed="rId8"/>
+                    <a:blip r:embed="rId9"/>
                     <a:stretch>
                       <a:fillRect/>
                     </a:stretch>
@@ -297,6 +312,9 @@
         <w:br/>
       </w:r>
       <w:r>
+        <w:rPr>
+          <w:noProof/>
+        </w:rPr>
         <w:drawing>
           <wp:inline distT="0" distB="0" distL="0" distR="0" wp14:anchorId="4BC41503" wp14:editId="715E0E37">
             <wp:extent cx="5612130" cy="2433955"/>
@@ -313,7 +331,7 @@
                     <pic:cNvPicPr/>
                   </pic:nvPicPr>
                   <pic:blipFill>
-                    <a:blip r:embed="rId9"/>
+                    <a:blip r:embed="rId10"/>
                     <a:stretch>
                       <a:fillRect/>
                     </a:stretch>
@@ -367,6 +385,9 @@
         <w:br/>
       </w:r>
       <w:r>
+        <w:rPr>
+          <w:noProof/>
+        </w:rPr>
         <w:drawing>
           <wp:inline distT="0" distB="0" distL="0" distR="0" wp14:anchorId="5E2AC980" wp14:editId="0208FFA0">
             <wp:extent cx="5612130" cy="2347595"/>
@@ -383,7 +404,7 @@
                     <pic:cNvPicPr/>
                   </pic:nvPicPr>
                   <pic:blipFill>
-                    <a:blip r:embed="rId10"/>
+                    <a:blip r:embed="rId11"/>
                     <a:stretch>
                       <a:fillRect/>
                     </a:stretch>
@@ -410,6 +431,9 @@
     </w:p>
     <w:p>
       <w:r>
+        <w:rPr>
+          <w:noProof/>
+        </w:rPr>
         <w:lastRenderedPageBreak/>
         <w:drawing>
           <wp:inline distT="0" distB="0" distL="0" distR="0" wp14:anchorId="05555225" wp14:editId="1A088487">
@@ -427,7 +451,7 @@
                     <pic:cNvPicPr/>
                   </pic:nvPicPr>
                   <pic:blipFill>
-                    <a:blip r:embed="rId11"/>
+                    <a:blip r:embed="rId12"/>
                     <a:stretch>
                       <a:fillRect/>
                     </a:stretch>
@@ -455,6 +479,9 @@
         <w:br/>
       </w:r>
       <w:r>
+        <w:rPr>
+          <w:noProof/>
+        </w:rPr>
         <w:drawing>
           <wp:inline distT="0" distB="0" distL="0" distR="0" wp14:anchorId="3788DACA" wp14:editId="5FEAFEE6">
             <wp:extent cx="5612130" cy="2840990"/>
@@ -471,7 +498,7 @@
                     <pic:cNvPicPr/>
                   </pic:nvPicPr>
                   <pic:blipFill>
-                    <a:blip r:embed="rId12"/>
+                    <a:blip r:embed="rId13"/>
                     <a:stretch>
                       <a:fillRect/>
                     </a:stretch>
@@ -492,7 +519,1438 @@
         </w:drawing>
       </w:r>
     </w:p>
-    <w:p/>
+    <w:p>
+      <w:pPr>
+        <w:rPr>
+          <w:b/>
+          <w:bCs/>
+        </w:rPr>
+      </w:pPr>
+      <w:r>
+        <w:rPr>
+          <w:b/>
+          <w:bCs/>
+        </w:rPr>
+        <w:t xml:space="preserve">Creación </w:t>
+      </w:r>
+      <w:proofErr w:type="gramStart"/>
+      <w:r>
+        <w:rPr>
+          <w:b/>
+          <w:bCs/>
+        </w:rPr>
+        <w:t>del modelo programada</w:t>
+      </w:r>
+      <w:proofErr w:type="gramEnd"/>
+      <w:r>
+        <w:rPr>
+          <w:b/>
+          <w:bCs/>
+        </w:rPr>
+        <w:t xml:space="preserve"> a objetos</w:t>
+      </w:r>
+    </w:p>
+    <w:p>
+      <w:r>
+        <w:t>Creación de la Sala</w:t>
+      </w:r>
+      <w:r>
+        <w:rPr>
+          <w:noProof/>
+        </w:rPr>
+        <w:drawing>
+          <wp:inline distT="0" distB="0" distL="0" distR="0" wp14:anchorId="5F30E3F3" wp14:editId="5BBCB222">
+            <wp:extent cx="5648325" cy="2991605"/>
+            <wp:effectExtent l="0" t="0" r="0" b="0"/>
+            <wp:docPr id="1715712438" name="Imagen 1" descr="Archivo adjunto del usuario"/>
+            <wp:cNvGraphicFramePr>
+              <a:graphicFrameLocks xmlns:a="http://schemas.openxmlformats.org/drawingml/2006/main" noChangeAspect="1"/>
+            </wp:cNvGraphicFramePr>
+            <a:graphic xmlns:a="http://schemas.openxmlformats.org/drawingml/2006/main">
+              <a:graphicData uri="http://schemas.openxmlformats.org/drawingml/2006/picture">
+                <pic:pic xmlns:pic="http://schemas.openxmlformats.org/drawingml/2006/picture">
+                  <pic:nvPicPr>
+                    <pic:cNvPr id="0" name="Picture 1" descr="Archivo adjunto del usuario"/>
+                    <pic:cNvPicPr>
+                      <a:picLocks noChangeAspect="1" noChangeArrowheads="1"/>
+                    </pic:cNvPicPr>
+                  </pic:nvPicPr>
+                  <pic:blipFill>
+                    <a:blip r:embed="rId14" cstate="print">
+                      <a:extLst>
+                        <a:ext uri="{28A0092B-C50C-407E-A947-70E740481C1C}">
+                          <a14:useLocalDpi xmlns:a14="http://schemas.microsoft.com/office/drawing/2010/main" val="0"/>
+                        </a:ext>
+                      </a:extLst>
+                    </a:blip>
+                    <a:srcRect/>
+                    <a:stretch>
+                      <a:fillRect/>
+                    </a:stretch>
+                  </pic:blipFill>
+                  <pic:spPr bwMode="auto">
+                    <a:xfrm>
+                      <a:off x="0" y="0"/>
+                      <a:ext cx="5654775" cy="2995021"/>
+                    </a:xfrm>
+                    <a:prstGeom prst="rect">
+                      <a:avLst/>
+                    </a:prstGeom>
+                    <a:noFill/>
+                    <a:ln>
+                      <a:noFill/>
+                    </a:ln>
+                  </pic:spPr>
+                </pic:pic>
+              </a:graphicData>
+            </a:graphic>
+          </wp:inline>
+        </w:drawing>
+      </w:r>
+    </w:p>
+    <w:p>
+      <w:r>
+        <w:lastRenderedPageBreak/>
+        <w:t>Creación de Reservas:</w:t>
+      </w:r>
+      <w:r>
+        <w:br/>
+      </w:r>
+      <w:r>
+        <w:t>Esta clase representará las reservas que realizan los clientes para utilizar las salas de ensayo.</w:t>
+      </w:r>
+      <w:r>
+        <w:br/>
+      </w:r>
+      <w:r>
+        <w:drawing>
+          <wp:inline distT="0" distB="0" distL="0" distR="0" wp14:anchorId="653A9352" wp14:editId="6843DEEB">
+            <wp:extent cx="5612130" cy="2857500"/>
+            <wp:effectExtent l="0" t="0" r="7620" b="0"/>
+            <wp:docPr id="27171526" name="Imagen 1"/>
+            <wp:cNvGraphicFramePr>
+              <a:graphicFrameLocks xmlns:a="http://schemas.openxmlformats.org/drawingml/2006/main" noChangeAspect="1"/>
+            </wp:cNvGraphicFramePr>
+            <a:graphic xmlns:a="http://schemas.openxmlformats.org/drawingml/2006/main">
+              <a:graphicData uri="http://schemas.openxmlformats.org/drawingml/2006/picture">
+                <pic:pic xmlns:pic="http://schemas.openxmlformats.org/drawingml/2006/picture">
+                  <pic:nvPicPr>
+                    <pic:cNvPr id="27171526" name=""/>
+                    <pic:cNvPicPr/>
+                  </pic:nvPicPr>
+                  <pic:blipFill>
+                    <a:blip r:embed="rId15"/>
+                    <a:stretch>
+                      <a:fillRect/>
+                    </a:stretch>
+                  </pic:blipFill>
+                  <pic:spPr>
+                    <a:xfrm>
+                      <a:off x="0" y="0"/>
+                      <a:ext cx="5612130" cy="2857500"/>
+                    </a:xfrm>
+                    <a:prstGeom prst="rect">
+                      <a:avLst/>
+                    </a:prstGeom>
+                  </pic:spPr>
+                </pic:pic>
+              </a:graphicData>
+            </a:graphic>
+          </wp:inline>
+        </w:drawing>
+      </w:r>
+      <w:r>
+        <w:br/>
+        <w:t>Teniendo estas dos clases puedo comenzar con la implementación de los datos almacenados en mi BD</w:t>
+      </w:r>
+      <w:r>
+        <w:br/>
+      </w:r>
+      <w:r>
+        <w:drawing>
+          <wp:inline distT="0" distB="0" distL="0" distR="0" wp14:anchorId="705741A6" wp14:editId="4AC35369">
+            <wp:extent cx="5612130" cy="2433955"/>
+            <wp:effectExtent l="0" t="0" r="7620" b="4445"/>
+            <wp:docPr id="2068328577" name="Imagen 1"/>
+            <wp:cNvGraphicFramePr>
+              <a:graphicFrameLocks xmlns:a="http://schemas.openxmlformats.org/drawingml/2006/main" noChangeAspect="1"/>
+            </wp:cNvGraphicFramePr>
+            <a:graphic xmlns:a="http://schemas.openxmlformats.org/drawingml/2006/main">
+              <a:graphicData uri="http://schemas.openxmlformats.org/drawingml/2006/picture">
+                <pic:pic xmlns:pic="http://schemas.openxmlformats.org/drawingml/2006/picture">
+                  <pic:nvPicPr>
+                    <pic:cNvPr id="2068328577" name=""/>
+                    <pic:cNvPicPr/>
+                  </pic:nvPicPr>
+                  <pic:blipFill>
+                    <a:blip r:embed="rId16"/>
+                    <a:stretch>
+                      <a:fillRect/>
+                    </a:stretch>
+                  </pic:blipFill>
+                  <pic:spPr>
+                    <a:xfrm>
+                      <a:off x="0" y="0"/>
+                      <a:ext cx="5612130" cy="2433955"/>
+                    </a:xfrm>
+                    <a:prstGeom prst="rect">
+                      <a:avLst/>
+                    </a:prstGeom>
+                  </pic:spPr>
+                </pic:pic>
+              </a:graphicData>
+            </a:graphic>
+          </wp:inline>
+        </w:drawing>
+      </w:r>
+      <w:r>
+        <w:br/>
+        <w:t xml:space="preserve">Antes de seguir, comenzaremos con las pruebas, para comunicarnos con la BD y convertirlo que ya </w:t>
+      </w:r>
+      <w:proofErr w:type="gramStart"/>
+      <w:r>
+        <w:t>ingrese</w:t>
+      </w:r>
+      <w:proofErr w:type="gramEnd"/>
+      <w:r>
+        <w:t xml:space="preserve"> en la BD en objetos Java.</w:t>
+      </w:r>
+      <w:r>
+        <w:br/>
+      </w:r>
+      <w:r>
+        <w:lastRenderedPageBreak/>
+        <w:drawing>
+          <wp:inline distT="0" distB="0" distL="0" distR="0" wp14:anchorId="17A86B8C" wp14:editId="13D98250">
+            <wp:extent cx="5612130" cy="2298065"/>
+            <wp:effectExtent l="0" t="0" r="7620" b="6985"/>
+            <wp:docPr id="1278134170" name="Imagen 1"/>
+            <wp:cNvGraphicFramePr>
+              <a:graphicFrameLocks xmlns:a="http://schemas.openxmlformats.org/drawingml/2006/main" noChangeAspect="1"/>
+            </wp:cNvGraphicFramePr>
+            <a:graphic xmlns:a="http://schemas.openxmlformats.org/drawingml/2006/main">
+              <a:graphicData uri="http://schemas.openxmlformats.org/drawingml/2006/picture">
+                <pic:pic xmlns:pic="http://schemas.openxmlformats.org/drawingml/2006/picture">
+                  <pic:nvPicPr>
+                    <pic:cNvPr id="1278134170" name=""/>
+                    <pic:cNvPicPr/>
+                  </pic:nvPicPr>
+                  <pic:blipFill>
+                    <a:blip r:embed="rId17"/>
+                    <a:stretch>
+                      <a:fillRect/>
+                    </a:stretch>
+                  </pic:blipFill>
+                  <pic:spPr>
+                    <a:xfrm>
+                      <a:off x="0" y="0"/>
+                      <a:ext cx="5612130" cy="2298065"/>
+                    </a:xfrm>
+                    <a:prstGeom prst="rect">
+                      <a:avLst/>
+                    </a:prstGeom>
+                  </pic:spPr>
+                </pic:pic>
+              </a:graphicData>
+            </a:graphic>
+          </wp:inline>
+        </w:drawing>
+      </w:r>
+      <w:r>
+        <w:br/>
+      </w:r>
+      <w:r>
+        <w:drawing>
+          <wp:inline distT="0" distB="0" distL="0" distR="0" wp14:anchorId="0EF28FC0" wp14:editId="30832472">
+            <wp:extent cx="5612130" cy="2446655"/>
+            <wp:effectExtent l="0" t="0" r="7620" b="0"/>
+            <wp:docPr id="736417021" name="Imagen 1"/>
+            <wp:cNvGraphicFramePr>
+              <a:graphicFrameLocks xmlns:a="http://schemas.openxmlformats.org/drawingml/2006/main" noChangeAspect="1"/>
+            </wp:cNvGraphicFramePr>
+            <a:graphic xmlns:a="http://schemas.openxmlformats.org/drawingml/2006/main">
+              <a:graphicData uri="http://schemas.openxmlformats.org/drawingml/2006/picture">
+                <pic:pic xmlns:pic="http://schemas.openxmlformats.org/drawingml/2006/picture">
+                  <pic:nvPicPr>
+                    <pic:cNvPr id="736417021" name=""/>
+                    <pic:cNvPicPr/>
+                  </pic:nvPicPr>
+                  <pic:blipFill>
+                    <a:blip r:embed="rId18"/>
+                    <a:stretch>
+                      <a:fillRect/>
+                    </a:stretch>
+                  </pic:blipFill>
+                  <pic:spPr>
+                    <a:xfrm>
+                      <a:off x="0" y="0"/>
+                      <a:ext cx="5612130" cy="2446655"/>
+                    </a:xfrm>
+                    <a:prstGeom prst="rect">
+                      <a:avLst/>
+                    </a:prstGeom>
+                  </pic:spPr>
+                </pic:pic>
+              </a:graphicData>
+            </a:graphic>
+          </wp:inline>
+        </w:drawing>
+      </w:r>
+      <w:r>
+        <w:br/>
+        <w:t>Con esto mostrare la funcionalidad de mi programa y sus salas, d</w:t>
+      </w:r>
+      <w:r>
+        <w:t>espués de mostrar las cuatro salas, el programa buscará específicamente la sala con ID 1</w:t>
+      </w:r>
+    </w:p>
+    <w:p>
+      <w:r>
+        <w:drawing>
+          <wp:inline distT="0" distB="0" distL="0" distR="0" wp14:anchorId="5518383F" wp14:editId="349CFE3D">
+            <wp:extent cx="5344284" cy="2686050"/>
+            <wp:effectExtent l="0" t="0" r="8890" b="0"/>
+            <wp:docPr id="1118953650" name="Imagen 1"/>
+            <wp:cNvGraphicFramePr>
+              <a:graphicFrameLocks xmlns:a="http://schemas.openxmlformats.org/drawingml/2006/main" noChangeAspect="1"/>
+            </wp:cNvGraphicFramePr>
+            <a:graphic xmlns:a="http://schemas.openxmlformats.org/drawingml/2006/main">
+              <a:graphicData uri="http://schemas.openxmlformats.org/drawingml/2006/picture">
+                <pic:pic xmlns:pic="http://schemas.openxmlformats.org/drawingml/2006/picture">
+                  <pic:nvPicPr>
+                    <pic:cNvPr id="1118953650" name=""/>
+                    <pic:cNvPicPr/>
+                  </pic:nvPicPr>
+                  <pic:blipFill>
+                    <a:blip r:embed="rId19"/>
+                    <a:stretch>
+                      <a:fillRect/>
+                    </a:stretch>
+                  </pic:blipFill>
+                  <pic:spPr>
+                    <a:xfrm>
+                      <a:off x="0" y="0"/>
+                      <a:ext cx="5353020" cy="2690441"/>
+                    </a:xfrm>
+                    <a:prstGeom prst="rect">
+                      <a:avLst/>
+                    </a:prstGeom>
+                  </pic:spPr>
+                </pic:pic>
+              </a:graphicData>
+            </a:graphic>
+          </wp:inline>
+        </w:drawing>
+      </w:r>
+    </w:p>
+    <w:p>
+      <w:pPr>
+        <w:rPr>
+          <w:noProof/>
+        </w:rPr>
+      </w:pPr>
+      <w:r>
+        <w:lastRenderedPageBreak/>
+        <w:drawing>
+          <wp:inline distT="0" distB="0" distL="0" distR="0" wp14:anchorId="1E6F53AA" wp14:editId="18327A79">
+            <wp:extent cx="5612130" cy="2820670"/>
+            <wp:effectExtent l="0" t="0" r="7620" b="0"/>
+            <wp:docPr id="569458844" name="Imagen 1"/>
+            <wp:cNvGraphicFramePr>
+              <a:graphicFrameLocks xmlns:a="http://schemas.openxmlformats.org/drawingml/2006/main" noChangeAspect="1"/>
+            </wp:cNvGraphicFramePr>
+            <a:graphic xmlns:a="http://schemas.openxmlformats.org/drawingml/2006/main">
+              <a:graphicData uri="http://schemas.openxmlformats.org/drawingml/2006/picture">
+                <pic:pic xmlns:pic="http://schemas.openxmlformats.org/drawingml/2006/picture">
+                  <pic:nvPicPr>
+                    <pic:cNvPr id="569458844" name=""/>
+                    <pic:cNvPicPr/>
+                  </pic:nvPicPr>
+                  <pic:blipFill>
+                    <a:blip r:embed="rId20"/>
+                    <a:stretch>
+                      <a:fillRect/>
+                    </a:stretch>
+                  </pic:blipFill>
+                  <pic:spPr>
+                    <a:xfrm>
+                      <a:off x="0" y="0"/>
+                      <a:ext cx="5612130" cy="2820670"/>
+                    </a:xfrm>
+                    <a:prstGeom prst="rect">
+                      <a:avLst/>
+                    </a:prstGeom>
+                  </pic:spPr>
+                </pic:pic>
+              </a:graphicData>
+            </a:graphic>
+          </wp:inline>
+        </w:drawing>
+      </w:r>
+      <w:r>
+        <w:rPr>
+          <w:noProof/>
+        </w:rPr>
+        <w:t xml:space="preserve"> </w:t>
+      </w:r>
+      <w:r>
+        <w:drawing>
+          <wp:inline distT="0" distB="0" distL="0" distR="0" wp14:anchorId="0402EF0D" wp14:editId="0AB66F7E">
+            <wp:extent cx="5612130" cy="1208405"/>
+            <wp:effectExtent l="0" t="0" r="7620" b="0"/>
+            <wp:docPr id="391534093" name="Imagen 1"/>
+            <wp:cNvGraphicFramePr>
+              <a:graphicFrameLocks xmlns:a="http://schemas.openxmlformats.org/drawingml/2006/main" noChangeAspect="1"/>
+            </wp:cNvGraphicFramePr>
+            <a:graphic xmlns:a="http://schemas.openxmlformats.org/drawingml/2006/main">
+              <a:graphicData uri="http://schemas.openxmlformats.org/drawingml/2006/picture">
+                <pic:pic xmlns:pic="http://schemas.openxmlformats.org/drawingml/2006/picture">
+                  <pic:nvPicPr>
+                    <pic:cNvPr id="391534093" name=""/>
+                    <pic:cNvPicPr/>
+                  </pic:nvPicPr>
+                  <pic:blipFill>
+                    <a:blip r:embed="rId21"/>
+                    <a:stretch>
+                      <a:fillRect/>
+                    </a:stretch>
+                  </pic:blipFill>
+                  <pic:spPr>
+                    <a:xfrm>
+                      <a:off x="0" y="0"/>
+                      <a:ext cx="5612130" cy="1208405"/>
+                    </a:xfrm>
+                    <a:prstGeom prst="rect">
+                      <a:avLst/>
+                    </a:prstGeom>
+                  </pic:spPr>
+                </pic:pic>
+              </a:graphicData>
+            </a:graphic>
+          </wp:inline>
+        </w:drawing>
+      </w:r>
+      <w:r>
+        <w:rPr>
+          <w:noProof/>
+        </w:rPr>
+        <w:br/>
+        <w:t>ahora crearemos el administrador de reservas relacionado a la BD</w:t>
+      </w:r>
+    </w:p>
+    <w:p>
+      <w:pPr>
+        <w:rPr>
+          <w:noProof/>
+        </w:rPr>
+      </w:pPr>
+      <w:r>
+        <w:rPr>
+          <w:noProof/>
+        </w:rPr>
+        <w:drawing>
+          <wp:inline distT="0" distB="0" distL="0" distR="0" wp14:anchorId="6CB27610" wp14:editId="65EB4806">
+            <wp:extent cx="5612130" cy="2191385"/>
+            <wp:effectExtent l="0" t="0" r="7620" b="0"/>
+            <wp:docPr id="287362416" name="Imagen 1"/>
+            <wp:cNvGraphicFramePr>
+              <a:graphicFrameLocks xmlns:a="http://schemas.openxmlformats.org/drawingml/2006/main" noChangeAspect="1"/>
+            </wp:cNvGraphicFramePr>
+            <a:graphic xmlns:a="http://schemas.openxmlformats.org/drawingml/2006/main">
+              <a:graphicData uri="http://schemas.openxmlformats.org/drawingml/2006/picture">
+                <pic:pic xmlns:pic="http://schemas.openxmlformats.org/drawingml/2006/picture">
+                  <pic:nvPicPr>
+                    <pic:cNvPr id="287362416" name=""/>
+                    <pic:cNvPicPr/>
+                  </pic:nvPicPr>
+                  <pic:blipFill>
+                    <a:blip r:embed="rId22"/>
+                    <a:stretch>
+                      <a:fillRect/>
+                    </a:stretch>
+                  </pic:blipFill>
+                  <pic:spPr>
+                    <a:xfrm>
+                      <a:off x="0" y="0"/>
+                      <a:ext cx="5612130" cy="2191385"/>
+                    </a:xfrm>
+                    <a:prstGeom prst="rect">
+                      <a:avLst/>
+                    </a:prstGeom>
+                  </pic:spPr>
+                </pic:pic>
+              </a:graphicData>
+            </a:graphic>
+          </wp:inline>
+        </w:drawing>
+      </w:r>
+      <w:r>
+        <w:rPr>
+          <w:noProof/>
+        </w:rPr>
+        <w:br/>
+        <w:t>ahora prepararemos nuestra base de datos para validar nuestras reservas</w:t>
+      </w:r>
+    </w:p>
+    <w:p>
+      <w:pPr>
+        <w:rPr>
+          <w:noProof/>
+        </w:rPr>
+      </w:pPr>
+      <w:r>
+        <w:rPr>
+          <w:noProof/>
+        </w:rPr>
+        <w:drawing>
+          <wp:inline distT="0" distB="0" distL="0" distR="0" wp14:anchorId="0F371A40" wp14:editId="35B6A5FC">
+            <wp:extent cx="5612130" cy="1274445"/>
+            <wp:effectExtent l="0" t="0" r="7620" b="1905"/>
+            <wp:docPr id="326164911" name="Imagen 1"/>
+            <wp:cNvGraphicFramePr>
+              <a:graphicFrameLocks xmlns:a="http://schemas.openxmlformats.org/drawingml/2006/main" noChangeAspect="1"/>
+            </wp:cNvGraphicFramePr>
+            <a:graphic xmlns:a="http://schemas.openxmlformats.org/drawingml/2006/main">
+              <a:graphicData uri="http://schemas.openxmlformats.org/drawingml/2006/picture">
+                <pic:pic xmlns:pic="http://schemas.openxmlformats.org/drawingml/2006/picture">
+                  <pic:nvPicPr>
+                    <pic:cNvPr id="326164911" name=""/>
+                    <pic:cNvPicPr/>
+                  </pic:nvPicPr>
+                  <pic:blipFill>
+                    <a:blip r:embed="rId23"/>
+                    <a:stretch>
+                      <a:fillRect/>
+                    </a:stretch>
+                  </pic:blipFill>
+                  <pic:spPr>
+                    <a:xfrm>
+                      <a:off x="0" y="0"/>
+                      <a:ext cx="5612130" cy="1274445"/>
+                    </a:xfrm>
+                    <a:prstGeom prst="rect">
+                      <a:avLst/>
+                    </a:prstGeom>
+                  </pic:spPr>
+                </pic:pic>
+              </a:graphicData>
+            </a:graphic>
+          </wp:inline>
+        </w:drawing>
+      </w:r>
+    </w:p>
+    <w:p>
+      <w:pPr>
+        <w:rPr>
+          <w:noProof/>
+        </w:rPr>
+      </w:pPr>
+      <w:r>
+        <w:rPr>
+          <w:noProof/>
+        </w:rPr>
+        <w:lastRenderedPageBreak/>
+        <w:t xml:space="preserve">Esta extension me permitira </w:t>
+      </w:r>
+      <w:r>
+        <w:rPr>
+          <w:noProof/>
+        </w:rPr>
+        <w:t xml:space="preserve">combinar comparaciones de igualdad con restricciones de rangos en </w:t>
+      </w:r>
+      <w:r>
+        <w:rPr>
+          <w:noProof/>
+        </w:rPr>
+        <w:t>mi BD</w:t>
+      </w:r>
+    </w:p>
+    <w:p>
+      <w:pPr>
+        <w:rPr>
+          <w:noProof/>
+        </w:rPr>
+      </w:pPr>
+      <w:r>
+        <w:rPr>
+          <w:noProof/>
+        </w:rPr>
+        <w:t>¿Qué significa esta restricción?</w:t>
+      </w:r>
+    </w:p>
+    <w:p>
+      <w:pPr>
+        <w:rPr>
+          <w:noProof/>
+        </w:rPr>
+      </w:pPr>
+      <w:r>
+        <w:rPr>
+          <w:noProof/>
+        </w:rPr>
+        <w:t>Supongamos que tenemos las siguientes solicitudes para la Sala Rock el mismo día:</w:t>
+      </w:r>
+      <w:r>
+        <w:rPr>
+          <w:noProof/>
+        </w:rPr>
+        <w:br/>
+      </w:r>
+    </w:p>
+    <w:tbl>
+      <w:tblPr>
+        <w:tblStyle w:val="Tablaconcuadrcula4-nfasis4"/>
+        <w:tblW w:w="0" w:type="auto"/>
+        <w:tblLook w:val="04A0" w:firstRow="1" w:lastRow="0" w:firstColumn="1" w:lastColumn="0" w:noHBand="0" w:noVBand="1"/>
+      </w:tblPr>
+      <w:tblGrid>
+        <w:gridCol w:w="2942"/>
+        <w:gridCol w:w="2943"/>
+        <w:gridCol w:w="2943"/>
+      </w:tblGrid>
+      <w:tr>
+        <w:trPr>
+          <w:cnfStyle w:val="100000000000" w:firstRow="1" w:lastRow="0" w:firstColumn="0" w:lastColumn="0" w:oddVBand="0" w:evenVBand="0" w:oddHBand="0" w:evenHBand="0" w:firstRowFirstColumn="0" w:firstRowLastColumn="0" w:lastRowFirstColumn="0" w:lastRowLastColumn="0"/>
+        </w:trPr>
+        <w:tc>
+          <w:tcPr>
+            <w:cnfStyle w:val="001000000000" w:firstRow="0" w:lastRow="0" w:firstColumn="1" w:lastColumn="0" w:oddVBand="0" w:evenVBand="0" w:oddHBand="0" w:evenHBand="0" w:firstRowFirstColumn="0" w:firstRowLastColumn="0" w:lastRowFirstColumn="0" w:lastRowLastColumn="0"/>
+            <w:tcW w:w="2942" w:type="dxa"/>
+          </w:tcPr>
+          <w:p>
+            <w:pPr>
+              <w:rPr>
+                <w:b w:val="0"/>
+                <w:bCs w:val="0"/>
+                <w:noProof/>
+              </w:rPr>
+            </w:pPr>
+            <w:r>
+              <w:rPr>
+                <w:b w:val="0"/>
+                <w:bCs w:val="0"/>
+                <w:noProof/>
+              </w:rPr>
+              <w:t>Cliente</w:t>
+            </w:r>
+          </w:p>
+        </w:tc>
+        <w:tc>
+          <w:tcPr>
+            <w:tcW w:w="2943" w:type="dxa"/>
+          </w:tcPr>
+          <w:p>
+            <w:pPr>
+              <w:cnfStyle w:val="100000000000" w:firstRow="1" w:lastRow="0" w:firstColumn="0" w:lastColumn="0" w:oddVBand="0" w:evenVBand="0" w:oddHBand="0" w:evenHBand="0" w:firstRowFirstColumn="0" w:firstRowLastColumn="0" w:lastRowFirstColumn="0" w:lastRowLastColumn="0"/>
+              <w:rPr>
+                <w:noProof/>
+              </w:rPr>
+            </w:pPr>
+            <w:r>
+              <w:rPr>
+                <w:noProof/>
+              </w:rPr>
+              <w:t>Horario</w:t>
+            </w:r>
+          </w:p>
+        </w:tc>
+        <w:tc>
+          <w:tcPr>
+            <w:tcW w:w="2943" w:type="dxa"/>
+          </w:tcPr>
+          <w:p>
+            <w:pPr>
+              <w:cnfStyle w:val="100000000000" w:firstRow="1" w:lastRow="0" w:firstColumn="0" w:lastColumn="0" w:oddVBand="0" w:evenVBand="0" w:oddHBand="0" w:evenHBand="0" w:firstRowFirstColumn="0" w:firstRowLastColumn="0" w:lastRowFirstColumn="0" w:lastRowLastColumn="0"/>
+              <w:rPr>
+                <w:noProof/>
+              </w:rPr>
+            </w:pPr>
+            <w:r>
+              <w:rPr>
+                <w:noProof/>
+              </w:rPr>
+              <w:t>Resultado</w:t>
+            </w:r>
+          </w:p>
+        </w:tc>
+      </w:tr>
+      <w:tr>
+        <w:trPr>
+          <w:cnfStyle w:val="000000100000" w:firstRow="0" w:lastRow="0" w:firstColumn="0" w:lastColumn="0" w:oddVBand="0" w:evenVBand="0" w:oddHBand="1" w:evenHBand="0" w:firstRowFirstColumn="0" w:firstRowLastColumn="0" w:lastRowFirstColumn="0" w:lastRowLastColumn="0"/>
+        </w:trPr>
+        <w:tc>
+          <w:tcPr>
+            <w:cnfStyle w:val="001000000000" w:firstRow="0" w:lastRow="0" w:firstColumn="1" w:lastColumn="0" w:oddVBand="0" w:evenVBand="0" w:oddHBand="0" w:evenHBand="0" w:firstRowFirstColumn="0" w:firstRowLastColumn="0" w:lastRowFirstColumn="0" w:lastRowLastColumn="0"/>
+            <w:tcW w:w="2942" w:type="dxa"/>
+          </w:tcPr>
+          <w:p>
+            <w:pPr>
+              <w:rPr>
+                <w:b w:val="0"/>
+                <w:bCs w:val="0"/>
+                <w:noProof/>
+              </w:rPr>
+            </w:pPr>
+            <w:r>
+              <w:rPr>
+                <w:b w:val="0"/>
+                <w:bCs w:val="0"/>
+                <w:noProof/>
+              </w:rPr>
+              <w:t>Banda A</w:t>
+            </w:r>
+          </w:p>
+        </w:tc>
+        <w:tc>
+          <w:tcPr>
+            <w:tcW w:w="2943" w:type="dxa"/>
+          </w:tcPr>
+          <w:p>
+            <w:pPr>
+              <w:cnfStyle w:val="000000100000" w:firstRow="0" w:lastRow="0" w:firstColumn="0" w:lastColumn="0" w:oddVBand="0" w:evenVBand="0" w:oddHBand="1" w:evenHBand="0" w:firstRowFirstColumn="0" w:firstRowLastColumn="0" w:lastRowFirstColumn="0" w:lastRowLastColumn="0"/>
+              <w:rPr>
+                <w:noProof/>
+              </w:rPr>
+            </w:pPr>
+            <w:r>
+              <w:rPr>
+                <w:noProof/>
+              </w:rPr>
+              <w:t>14:00 – 16:00</w:t>
+            </w:r>
+          </w:p>
+        </w:tc>
+        <w:tc>
+          <w:tcPr>
+            <w:tcW w:w="2943" w:type="dxa"/>
+          </w:tcPr>
+          <w:p>
+            <w:pPr>
+              <w:cnfStyle w:val="000000100000" w:firstRow="0" w:lastRow="0" w:firstColumn="0" w:lastColumn="0" w:oddVBand="0" w:evenVBand="0" w:oddHBand="1" w:evenHBand="0" w:firstRowFirstColumn="0" w:firstRowLastColumn="0" w:lastRowFirstColumn="0" w:lastRowLastColumn="0"/>
+              <w:rPr>
+                <w:noProof/>
+              </w:rPr>
+            </w:pPr>
+            <w:r>
+              <w:rPr>
+                <w:noProof/>
+              </w:rPr>
+              <w:t>Permitida</w:t>
+            </w:r>
+          </w:p>
+        </w:tc>
+      </w:tr>
+      <w:tr>
+        <w:tc>
+          <w:tcPr>
+            <w:cnfStyle w:val="001000000000" w:firstRow="0" w:lastRow="0" w:firstColumn="1" w:lastColumn="0" w:oddVBand="0" w:evenVBand="0" w:oddHBand="0" w:evenHBand="0" w:firstRowFirstColumn="0" w:firstRowLastColumn="0" w:lastRowFirstColumn="0" w:lastRowLastColumn="0"/>
+            <w:tcW w:w="2942" w:type="dxa"/>
+          </w:tcPr>
+          <w:p>
+            <w:pPr>
+              <w:rPr>
+                <w:b w:val="0"/>
+                <w:bCs w:val="0"/>
+                <w:noProof/>
+              </w:rPr>
+            </w:pPr>
+            <w:r>
+              <w:rPr>
+                <w:b w:val="0"/>
+                <w:bCs w:val="0"/>
+                <w:noProof/>
+              </w:rPr>
+              <w:t xml:space="preserve">Banda </w:t>
+            </w:r>
+            <w:r>
+              <w:rPr>
+                <w:b w:val="0"/>
+                <w:bCs w:val="0"/>
+                <w:noProof/>
+              </w:rPr>
+              <w:t>B</w:t>
+            </w:r>
+          </w:p>
+        </w:tc>
+        <w:tc>
+          <w:tcPr>
+            <w:tcW w:w="2943" w:type="dxa"/>
+          </w:tcPr>
+          <w:p>
+            <w:pPr>
+              <w:cnfStyle w:val="000000000000" w:firstRow="0" w:lastRow="0" w:firstColumn="0" w:lastColumn="0" w:oddVBand="0" w:evenVBand="0" w:oddHBand="0" w:evenHBand="0" w:firstRowFirstColumn="0" w:firstRowLastColumn="0" w:lastRowFirstColumn="0" w:lastRowLastColumn="0"/>
+              <w:rPr>
+                <w:noProof/>
+              </w:rPr>
+            </w:pPr>
+            <w:r>
+              <w:rPr>
+                <w:noProof/>
+              </w:rPr>
+              <w:t>1</w:t>
+            </w:r>
+            <w:r>
+              <w:rPr>
+                <w:noProof/>
+              </w:rPr>
+              <w:t>5</w:t>
+            </w:r>
+            <w:r>
+              <w:rPr>
+                <w:noProof/>
+              </w:rPr>
+              <w:t>:00 – 1</w:t>
+            </w:r>
+            <w:r>
+              <w:rPr>
+                <w:noProof/>
+              </w:rPr>
+              <w:t>7</w:t>
+            </w:r>
+            <w:r>
+              <w:rPr>
+                <w:noProof/>
+              </w:rPr>
+              <w:t>:00</w:t>
+            </w:r>
+          </w:p>
+        </w:tc>
+        <w:tc>
+          <w:tcPr>
+            <w:tcW w:w="2943" w:type="dxa"/>
+          </w:tcPr>
+          <w:p>
+            <w:pPr>
+              <w:cnfStyle w:val="000000000000" w:firstRow="0" w:lastRow="0" w:firstColumn="0" w:lastColumn="0" w:oddVBand="0" w:evenVBand="0" w:oddHBand="0" w:evenHBand="0" w:firstRowFirstColumn="0" w:firstRowLastColumn="0" w:lastRowFirstColumn="0" w:lastRowLastColumn="0"/>
+              <w:rPr>
+                <w:noProof/>
+              </w:rPr>
+            </w:pPr>
+            <w:r>
+              <w:rPr>
+                <w:noProof/>
+              </w:rPr>
+              <w:t>Rechazada</w:t>
+            </w:r>
+          </w:p>
+        </w:tc>
+      </w:tr>
+      <w:tr>
+        <w:trPr>
+          <w:cnfStyle w:val="000000100000" w:firstRow="0" w:lastRow="0" w:firstColumn="0" w:lastColumn="0" w:oddVBand="0" w:evenVBand="0" w:oddHBand="1" w:evenHBand="0" w:firstRowFirstColumn="0" w:firstRowLastColumn="0" w:lastRowFirstColumn="0" w:lastRowLastColumn="0"/>
+        </w:trPr>
+        <w:tc>
+          <w:tcPr>
+            <w:cnfStyle w:val="001000000000" w:firstRow="0" w:lastRow="0" w:firstColumn="1" w:lastColumn="0" w:oddVBand="0" w:evenVBand="0" w:oddHBand="0" w:evenHBand="0" w:firstRowFirstColumn="0" w:firstRowLastColumn="0" w:lastRowFirstColumn="0" w:lastRowLastColumn="0"/>
+            <w:tcW w:w="2942" w:type="dxa"/>
+          </w:tcPr>
+          <w:p>
+            <w:pPr>
+              <w:rPr>
+                <w:noProof/>
+              </w:rPr>
+            </w:pPr>
+            <w:r>
+              <w:rPr>
+                <w:b w:val="0"/>
+                <w:bCs w:val="0"/>
+                <w:noProof/>
+              </w:rPr>
+              <w:t xml:space="preserve">Banda </w:t>
+            </w:r>
+            <w:r>
+              <w:rPr>
+                <w:b w:val="0"/>
+                <w:bCs w:val="0"/>
+                <w:noProof/>
+              </w:rPr>
+              <w:t>C</w:t>
+            </w:r>
+          </w:p>
+        </w:tc>
+        <w:tc>
+          <w:tcPr>
+            <w:tcW w:w="2943" w:type="dxa"/>
+          </w:tcPr>
+          <w:p>
+            <w:pPr>
+              <w:cnfStyle w:val="000000100000" w:firstRow="0" w:lastRow="0" w:firstColumn="0" w:lastColumn="0" w:oddVBand="0" w:evenVBand="0" w:oddHBand="1" w:evenHBand="0" w:firstRowFirstColumn="0" w:firstRowLastColumn="0" w:lastRowFirstColumn="0" w:lastRowLastColumn="0"/>
+              <w:rPr>
+                <w:noProof/>
+              </w:rPr>
+            </w:pPr>
+            <w:r>
+              <w:rPr>
+                <w:noProof/>
+              </w:rPr>
+              <w:t>1</w:t>
+            </w:r>
+            <w:r>
+              <w:rPr>
+                <w:noProof/>
+              </w:rPr>
+              <w:t>6</w:t>
+            </w:r>
+            <w:r>
+              <w:rPr>
+                <w:noProof/>
+              </w:rPr>
+              <w:t>:00 – 1</w:t>
+            </w:r>
+            <w:r>
+              <w:rPr>
+                <w:noProof/>
+              </w:rPr>
+              <w:t>8</w:t>
+            </w:r>
+            <w:r>
+              <w:rPr>
+                <w:noProof/>
+              </w:rPr>
+              <w:t>:00</w:t>
+            </w:r>
+          </w:p>
+        </w:tc>
+        <w:tc>
+          <w:tcPr>
+            <w:tcW w:w="2943" w:type="dxa"/>
+          </w:tcPr>
+          <w:p>
+            <w:pPr>
+              <w:cnfStyle w:val="000000100000" w:firstRow="0" w:lastRow="0" w:firstColumn="0" w:lastColumn="0" w:oddVBand="0" w:evenVBand="0" w:oddHBand="1" w:evenHBand="0" w:firstRowFirstColumn="0" w:firstRowLastColumn="0" w:lastRowFirstColumn="0" w:lastRowLastColumn="0"/>
+              <w:rPr>
+                <w:noProof/>
+              </w:rPr>
+            </w:pPr>
+            <w:r>
+              <w:rPr>
+                <w:noProof/>
+              </w:rPr>
+              <w:t>Permitida</w:t>
+            </w:r>
+          </w:p>
+        </w:tc>
+      </w:tr>
+      <w:tr>
+        <w:tc>
+          <w:tcPr>
+            <w:cnfStyle w:val="001000000000" w:firstRow="0" w:lastRow="0" w:firstColumn="1" w:lastColumn="0" w:oddVBand="0" w:evenVBand="0" w:oddHBand="0" w:evenHBand="0" w:firstRowFirstColumn="0" w:firstRowLastColumn="0" w:lastRowFirstColumn="0" w:lastRowLastColumn="0"/>
+            <w:tcW w:w="2942" w:type="dxa"/>
+          </w:tcPr>
+          <w:p>
+            <w:pPr>
+              <w:rPr>
+                <w:noProof/>
+              </w:rPr>
+            </w:pPr>
+            <w:r>
+              <w:rPr>
+                <w:b w:val="0"/>
+                <w:bCs w:val="0"/>
+                <w:noProof/>
+              </w:rPr>
+              <w:t xml:space="preserve">Banda </w:t>
+            </w:r>
+            <w:r>
+              <w:rPr>
+                <w:b w:val="0"/>
+                <w:bCs w:val="0"/>
+                <w:noProof/>
+              </w:rPr>
+              <w:t>D</w:t>
+            </w:r>
+          </w:p>
+        </w:tc>
+        <w:tc>
+          <w:tcPr>
+            <w:tcW w:w="2943" w:type="dxa"/>
+          </w:tcPr>
+          <w:p>
+            <w:pPr>
+              <w:cnfStyle w:val="000000000000" w:firstRow="0" w:lastRow="0" w:firstColumn="0" w:lastColumn="0" w:oddVBand="0" w:evenVBand="0" w:oddHBand="0" w:evenHBand="0" w:firstRowFirstColumn="0" w:firstRowLastColumn="0" w:lastRowFirstColumn="0" w:lastRowLastColumn="0"/>
+              <w:rPr>
+                <w:noProof/>
+              </w:rPr>
+            </w:pPr>
+            <w:r>
+              <w:rPr>
+                <w:noProof/>
+              </w:rPr>
+              <w:t>14:00 – 1</w:t>
+            </w:r>
+            <w:r>
+              <w:rPr>
+                <w:noProof/>
+              </w:rPr>
+              <w:t>5</w:t>
+            </w:r>
+            <w:r>
+              <w:rPr>
+                <w:noProof/>
+              </w:rPr>
+              <w:t>:00</w:t>
+            </w:r>
+            <w:r>
+              <w:rPr>
+                <w:noProof/>
+              </w:rPr>
+              <w:t>, otra sala</w:t>
+            </w:r>
+          </w:p>
+        </w:tc>
+        <w:tc>
+          <w:tcPr>
+            <w:tcW w:w="2943" w:type="dxa"/>
+          </w:tcPr>
+          <w:p>
+            <w:pPr>
+              <w:cnfStyle w:val="000000000000" w:firstRow="0" w:lastRow="0" w:firstColumn="0" w:lastColumn="0" w:oddVBand="0" w:evenVBand="0" w:oddHBand="0" w:evenHBand="0" w:firstRowFirstColumn="0" w:firstRowLastColumn="0" w:lastRowFirstColumn="0" w:lastRowLastColumn="0"/>
+              <w:rPr>
+                <w:noProof/>
+              </w:rPr>
+            </w:pPr>
+            <w:r>
+              <w:rPr>
+                <w:noProof/>
+              </w:rPr>
+              <w:t>Permitida</w:t>
+            </w:r>
+          </w:p>
+        </w:tc>
+      </w:tr>
+    </w:tbl>
+    <w:p>
+      <w:pPr>
+        <w:rPr>
+          <w:noProof/>
+        </w:rPr>
+      </w:pPr>
+      <w:r>
+        <w:rPr>
+          <w:noProof/>
+        </w:rPr>
+        <w:drawing>
+          <wp:inline distT="0" distB="0" distL="0" distR="0" wp14:anchorId="0C84276F" wp14:editId="032811B8">
+            <wp:extent cx="5612130" cy="2018665"/>
+            <wp:effectExtent l="0" t="0" r="7620" b="635"/>
+            <wp:docPr id="1286962515" name="Imagen 1"/>
+            <wp:cNvGraphicFramePr>
+              <a:graphicFrameLocks xmlns:a="http://schemas.openxmlformats.org/drawingml/2006/main" noChangeAspect="1"/>
+            </wp:cNvGraphicFramePr>
+            <a:graphic xmlns:a="http://schemas.openxmlformats.org/drawingml/2006/main">
+              <a:graphicData uri="http://schemas.openxmlformats.org/drawingml/2006/picture">
+                <pic:pic xmlns:pic="http://schemas.openxmlformats.org/drawingml/2006/picture">
+                  <pic:nvPicPr>
+                    <pic:cNvPr id="1286962515" name=""/>
+                    <pic:cNvPicPr/>
+                  </pic:nvPicPr>
+                  <pic:blipFill>
+                    <a:blip r:embed="rId24"/>
+                    <a:stretch>
+                      <a:fillRect/>
+                    </a:stretch>
+                  </pic:blipFill>
+                  <pic:spPr>
+                    <a:xfrm>
+                      <a:off x="0" y="0"/>
+                      <a:ext cx="5612130" cy="2018665"/>
+                    </a:xfrm>
+                    <a:prstGeom prst="rect">
+                      <a:avLst/>
+                    </a:prstGeom>
+                  </pic:spPr>
+                </pic:pic>
+              </a:graphicData>
+            </a:graphic>
+          </wp:inline>
+        </w:drawing>
+      </w:r>
+    </w:p>
+    <w:p>
+      <w:pPr>
+        <w:rPr>
+          <w:noProof/>
+        </w:rPr>
+      </w:pPr>
+      <w:r>
+        <w:rPr>
+          <w:noProof/>
+        </w:rPr>
+        <w:t>Evidencia de consulta</w:t>
+      </w:r>
+    </w:p>
+    <w:p>
+      <w:pPr>
+        <w:rPr>
+          <w:noProof/>
+        </w:rPr>
+      </w:pPr>
+      <w:r>
+        <w:rPr>
+          <w:noProof/>
+        </w:rPr>
+        <w:drawing>
+          <wp:inline distT="0" distB="0" distL="0" distR="0" wp14:anchorId="0F22D3B1" wp14:editId="672FBE81">
+            <wp:extent cx="5612130" cy="1792605"/>
+            <wp:effectExtent l="0" t="0" r="7620" b="0"/>
+            <wp:docPr id="1448401967" name="Imagen 1"/>
+            <wp:cNvGraphicFramePr>
+              <a:graphicFrameLocks xmlns:a="http://schemas.openxmlformats.org/drawingml/2006/main" noChangeAspect="1"/>
+            </wp:cNvGraphicFramePr>
+            <a:graphic xmlns:a="http://schemas.openxmlformats.org/drawingml/2006/main">
+              <a:graphicData uri="http://schemas.openxmlformats.org/drawingml/2006/picture">
+                <pic:pic xmlns:pic="http://schemas.openxmlformats.org/drawingml/2006/picture">
+                  <pic:nvPicPr>
+                    <pic:cNvPr id="1448401967" name=""/>
+                    <pic:cNvPicPr/>
+                  </pic:nvPicPr>
+                  <pic:blipFill>
+                    <a:blip r:embed="rId25"/>
+                    <a:stretch>
+                      <a:fillRect/>
+                    </a:stretch>
+                  </pic:blipFill>
+                  <pic:spPr>
+                    <a:xfrm>
+                      <a:off x="0" y="0"/>
+                      <a:ext cx="5612130" cy="1792605"/>
+                    </a:xfrm>
+                    <a:prstGeom prst="rect">
+                      <a:avLst/>
+                    </a:prstGeom>
+                  </pic:spPr>
+                </pic:pic>
+              </a:graphicData>
+            </a:graphic>
+          </wp:inline>
+        </w:drawing>
+      </w:r>
+      <w:r>
+        <w:rPr>
+          <w:noProof/>
+        </w:rPr>
+        <w:br/>
+      </w:r>
+      <w:r>
+        <w:rPr>
+          <w:noProof/>
+        </w:rPr>
+        <w:t>ahora que ya tenemos la restricción podemos seguir con el registro de reservas</w:t>
+      </w:r>
+    </w:p>
+    <w:p>
+      <w:pPr>
+        <w:rPr>
+          <w:noProof/>
+        </w:rPr>
+      </w:pPr>
+      <w:r>
+        <w:rPr>
+          <w:noProof/>
+        </w:rPr>
+        <w:lastRenderedPageBreak/>
+        <w:drawing>
+          <wp:inline distT="0" distB="0" distL="0" distR="0" wp14:anchorId="3203CC42" wp14:editId="7AA7A5C5">
+            <wp:extent cx="5612130" cy="2397125"/>
+            <wp:effectExtent l="0" t="0" r="7620" b="3175"/>
+            <wp:docPr id="1753441465" name="Imagen 1"/>
+            <wp:cNvGraphicFramePr>
+              <a:graphicFrameLocks xmlns:a="http://schemas.openxmlformats.org/drawingml/2006/main" noChangeAspect="1"/>
+            </wp:cNvGraphicFramePr>
+            <a:graphic xmlns:a="http://schemas.openxmlformats.org/drawingml/2006/main">
+              <a:graphicData uri="http://schemas.openxmlformats.org/drawingml/2006/picture">
+                <pic:pic xmlns:pic="http://schemas.openxmlformats.org/drawingml/2006/picture">
+                  <pic:nvPicPr>
+                    <pic:cNvPr id="1753441465" name=""/>
+                    <pic:cNvPicPr/>
+                  </pic:nvPicPr>
+                  <pic:blipFill>
+                    <a:blip r:embed="rId26"/>
+                    <a:stretch>
+                      <a:fillRect/>
+                    </a:stretch>
+                  </pic:blipFill>
+                  <pic:spPr>
+                    <a:xfrm>
+                      <a:off x="0" y="0"/>
+                      <a:ext cx="5612130" cy="2397125"/>
+                    </a:xfrm>
+                    <a:prstGeom prst="rect">
+                      <a:avLst/>
+                    </a:prstGeom>
+                  </pic:spPr>
+                </pic:pic>
+              </a:graphicData>
+            </a:graphic>
+          </wp:inline>
+        </w:drawing>
+      </w:r>
+      <w:r>
+        <w:rPr>
+          <w:noProof/>
+        </w:rPr>
+        <w:br/>
+        <w:t>Comprobacion del registro de reservas</w:t>
+      </w:r>
+    </w:p>
+    <w:p>
+      <w:pPr>
+        <w:rPr>
+          <w:noProof/>
+        </w:rPr>
+      </w:pPr>
+      <w:r>
+        <w:rPr>
+          <w:noProof/>
+        </w:rPr>
+        <w:drawing>
+          <wp:inline distT="0" distB="0" distL="0" distR="0" wp14:anchorId="3324D020" wp14:editId="7EDD32D4">
+            <wp:extent cx="5612130" cy="2822575"/>
+            <wp:effectExtent l="0" t="0" r="7620" b="0"/>
+            <wp:docPr id="1465370130" name="Imagen 1"/>
+            <wp:cNvGraphicFramePr>
+              <a:graphicFrameLocks xmlns:a="http://schemas.openxmlformats.org/drawingml/2006/main" noChangeAspect="1"/>
+            </wp:cNvGraphicFramePr>
+            <a:graphic xmlns:a="http://schemas.openxmlformats.org/drawingml/2006/main">
+              <a:graphicData uri="http://schemas.openxmlformats.org/drawingml/2006/picture">
+                <pic:pic xmlns:pic="http://schemas.openxmlformats.org/drawingml/2006/picture">
+                  <pic:nvPicPr>
+                    <pic:cNvPr id="1465370130" name=""/>
+                    <pic:cNvPicPr/>
+                  </pic:nvPicPr>
+                  <pic:blipFill>
+                    <a:blip r:embed="rId27"/>
+                    <a:stretch>
+                      <a:fillRect/>
+                    </a:stretch>
+                  </pic:blipFill>
+                  <pic:spPr>
+                    <a:xfrm>
+                      <a:off x="0" y="0"/>
+                      <a:ext cx="5612130" cy="2822575"/>
+                    </a:xfrm>
+                    <a:prstGeom prst="rect">
+                      <a:avLst/>
+                    </a:prstGeom>
+                  </pic:spPr>
+                </pic:pic>
+              </a:graphicData>
+            </a:graphic>
+          </wp:inline>
+        </w:drawing>
+      </w:r>
+    </w:p>
+    <w:p>
+      <w:pPr>
+        <w:rPr>
+          <w:noProof/>
+        </w:rPr>
+      </w:pPr>
+      <w:r>
+        <w:rPr>
+          <w:noProof/>
+        </w:rPr>
+        <w:lastRenderedPageBreak/>
+        <w:drawing>
+          <wp:inline distT="0" distB="0" distL="0" distR="0" wp14:anchorId="570B4E90" wp14:editId="29948D0F">
+            <wp:extent cx="5612130" cy="2766695"/>
+            <wp:effectExtent l="0" t="0" r="7620" b="0"/>
+            <wp:docPr id="1523357048" name="Imagen 1"/>
+            <wp:cNvGraphicFramePr>
+              <a:graphicFrameLocks xmlns:a="http://schemas.openxmlformats.org/drawingml/2006/main" noChangeAspect="1"/>
+            </wp:cNvGraphicFramePr>
+            <a:graphic xmlns:a="http://schemas.openxmlformats.org/drawingml/2006/main">
+              <a:graphicData uri="http://schemas.openxmlformats.org/drawingml/2006/picture">
+                <pic:pic xmlns:pic="http://schemas.openxmlformats.org/drawingml/2006/picture">
+                  <pic:nvPicPr>
+                    <pic:cNvPr id="1523357048" name=""/>
+                    <pic:cNvPicPr/>
+                  </pic:nvPicPr>
+                  <pic:blipFill>
+                    <a:blip r:embed="rId28"/>
+                    <a:stretch>
+                      <a:fillRect/>
+                    </a:stretch>
+                  </pic:blipFill>
+                  <pic:spPr>
+                    <a:xfrm>
+                      <a:off x="0" y="0"/>
+                      <a:ext cx="5612130" cy="2766695"/>
+                    </a:xfrm>
+                    <a:prstGeom prst="rect">
+                      <a:avLst/>
+                    </a:prstGeom>
+                  </pic:spPr>
+                </pic:pic>
+              </a:graphicData>
+            </a:graphic>
+          </wp:inline>
+        </w:drawing>
+      </w:r>
+      <w:r>
+        <w:rPr>
+          <w:noProof/>
+        </w:rPr>
+        <w:br/>
+        <w:t>Verificare en la BD si se registro correctamente</w:t>
+      </w:r>
+    </w:p>
+    <w:p>
+      <w:pPr>
+        <w:rPr>
+          <w:noProof/>
+        </w:rPr>
+      </w:pPr>
+      <w:r>
+        <w:rPr>
+          <w:noProof/>
+        </w:rPr>
+        <w:drawing>
+          <wp:inline distT="0" distB="0" distL="0" distR="0" wp14:anchorId="11B246E6" wp14:editId="54CD6F3D">
+            <wp:extent cx="5612130" cy="2002155"/>
+            <wp:effectExtent l="0" t="0" r="7620" b="0"/>
+            <wp:docPr id="1844521098" name="Imagen 1"/>
+            <wp:cNvGraphicFramePr>
+              <a:graphicFrameLocks xmlns:a="http://schemas.openxmlformats.org/drawingml/2006/main" noChangeAspect="1"/>
+            </wp:cNvGraphicFramePr>
+            <a:graphic xmlns:a="http://schemas.openxmlformats.org/drawingml/2006/main">
+              <a:graphicData uri="http://schemas.openxmlformats.org/drawingml/2006/picture">
+                <pic:pic xmlns:pic="http://schemas.openxmlformats.org/drawingml/2006/picture">
+                  <pic:nvPicPr>
+                    <pic:cNvPr id="1844521098" name=""/>
+                    <pic:cNvPicPr/>
+                  </pic:nvPicPr>
+                  <pic:blipFill>
+                    <a:blip r:embed="rId29"/>
+                    <a:stretch>
+                      <a:fillRect/>
+                    </a:stretch>
+                  </pic:blipFill>
+                  <pic:spPr>
+                    <a:xfrm>
+                      <a:off x="0" y="0"/>
+                      <a:ext cx="5612130" cy="2002155"/>
+                    </a:xfrm>
+                    <a:prstGeom prst="rect">
+                      <a:avLst/>
+                    </a:prstGeom>
+                  </pic:spPr>
+                </pic:pic>
+              </a:graphicData>
+            </a:graphic>
+          </wp:inline>
+        </w:drawing>
+      </w:r>
+      <w:r>
+        <w:rPr>
+          <w:noProof/>
+        </w:rPr>
+        <w:br/>
+        <w:t>ahora realizare las dos consultas que se solicitan.</w:t>
+      </w:r>
+    </w:p>
+    <w:p>
+      <w:pPr>
+        <w:pStyle w:val="Prrafodelista"/>
+        <w:numPr>
+          <w:ilvl w:val="0"/>
+          <w:numId w:val="1"/>
+        </w:numPr>
+        <w:rPr>
+          <w:noProof/>
+        </w:rPr>
+      </w:pPr>
+      <w:r>
+        <w:rPr>
+          <w:noProof/>
+        </w:rPr>
+        <w:t>Consultar todas las reservas de una fecha específica.</w:t>
+      </w:r>
+    </w:p>
+    <w:p>
+      <w:pPr>
+        <w:pStyle w:val="Prrafodelista"/>
+        <w:numPr>
+          <w:ilvl w:val="0"/>
+          <w:numId w:val="1"/>
+        </w:numPr>
+        <w:rPr>
+          <w:noProof/>
+        </w:rPr>
+      </w:pPr>
+      <w:r>
+        <w:rPr>
+          <w:noProof/>
+        </w:rPr>
+        <w:t>Buscar las reservas realizadas por un cliente o banda.</w:t>
+      </w:r>
+    </w:p>
+    <w:p>
+      <w:pPr>
+        <w:rPr>
+          <w:noProof/>
+        </w:rPr>
+      </w:pPr>
+      <w:r>
+        <w:rPr>
+          <w:noProof/>
+        </w:rPr>
+        <w:drawing>
+          <wp:inline distT="0" distB="0" distL="0" distR="0" wp14:anchorId="6ED6F1C8" wp14:editId="0F8CC9C9">
+            <wp:extent cx="5343525" cy="2176589"/>
+            <wp:effectExtent l="0" t="0" r="0" b="0"/>
+            <wp:docPr id="1139136666" name="Imagen 1"/>
+            <wp:cNvGraphicFramePr>
+              <a:graphicFrameLocks xmlns:a="http://schemas.openxmlformats.org/drawingml/2006/main" noChangeAspect="1"/>
+            </wp:cNvGraphicFramePr>
+            <a:graphic xmlns:a="http://schemas.openxmlformats.org/drawingml/2006/main">
+              <a:graphicData uri="http://schemas.openxmlformats.org/drawingml/2006/picture">
+                <pic:pic xmlns:pic="http://schemas.openxmlformats.org/drawingml/2006/picture">
+                  <pic:nvPicPr>
+                    <pic:cNvPr id="1139136666" name=""/>
+                    <pic:cNvPicPr/>
+                  </pic:nvPicPr>
+                  <pic:blipFill>
+                    <a:blip r:embed="rId30"/>
+                    <a:stretch>
+                      <a:fillRect/>
+                    </a:stretch>
+                  </pic:blipFill>
+                  <pic:spPr>
+                    <a:xfrm>
+                      <a:off x="0" y="0"/>
+                      <a:ext cx="5347785" cy="2178324"/>
+                    </a:xfrm>
+                    <a:prstGeom prst="rect">
+                      <a:avLst/>
+                    </a:prstGeom>
+                  </pic:spPr>
+                </pic:pic>
+              </a:graphicData>
+            </a:graphic>
+          </wp:inline>
+        </w:drawing>
+      </w:r>
+    </w:p>
+    <w:p>
+      <w:pPr>
+        <w:rPr>
+          <w:noProof/>
+        </w:rPr>
+      </w:pPr>
+    </w:p>
+    <w:p>
+      <w:pPr>
+        <w:rPr>
+          <w:noProof/>
+        </w:rPr>
+      </w:pPr>
+    </w:p>
+    <w:p>
+      <w:r>
+        <w:br/>
+      </w:r>
+    </w:p>
     <w:p/>
     <w:sectPr>
       <w:pgSz w:w="12240" w:h="15840"/>
@@ -502,6 +1960,127 @@
     </w:sectPr>
   </w:body>
 </w:document>
+</file>
+
+<file path=word/numbering.xml><?xml version="1.0" encoding="utf-8"?>
+<w:numbering xmlns:wpc="http://schemas.microsoft.com/office/word/2010/wordprocessingCanvas" xmlns:cx="http://schemas.microsoft.com/office/drawing/2014/chartex" xmlns:cx1="http://schemas.microsoft.com/office/drawing/2015/9/8/chartex" xmlns:cx2="http://schemas.microsoft.com/office/drawing/2015/10/21/chartex" xmlns:cx3="http://schemas.microsoft.com/office/drawing/2016/5/9/chartex" xmlns:cx4="http://schemas.microsoft.com/office/drawing/2016/5/10/chartex" xmlns:cx5="http://schemas.microsoft.com/office/drawing/2016/5/11/chartex" xmlns:cx6="http://schemas.microsoft.com/office/drawing/2016/5/12/chartex" xmlns:cx7="http://schemas.microsoft.com/office/drawing/2016/5/13/chartex" xmlns:cx8="http://schemas.microsoft.com/office/drawing/2016/5/14/chartex" xmlns:mc="http://schemas.openxmlformats.org/markup-compatibility/2006" xmlns:aink="http://schemas.microsoft.com/office/drawing/2016/ink" xmlns:am3d="http://schemas.microsoft.com/office/drawing/2017/model3d" xmlns:o="urn:schemas-microsoft-com:office:office" xmlns:oel="http://schemas.microsoft.com/office/2019/extlst" xmlns:r="http://schemas.openxmlformats.org/officeDocument/2006/relationships" xmlns:m="http://schemas.openxmlformats.org/officeDocument/2006/math" xmlns:v="urn:schemas-microsoft-com:vml" xmlns:wp14="http://schemas.microsoft.com/office/word/2010/wordprocessingDrawing" xmlns:wp="http://schemas.openxmlformats.org/drawingml/2006/wordprocessingDrawing" xmlns:w10="urn:schemas-microsoft-com:office:word" xmlns:w="http://schemas.openxmlformats.org/wordprocessingml/2006/main" xmlns:w14="http://schemas.microsoft.com/office/word/2010/wordml" xmlns:w15="http://schemas.microsoft.com/office/word/2012/wordml" xmlns:w16cex="http://schemas.microsoft.com/office/word/2018/wordml/cex" xmlns:w16cid="http://schemas.microsoft.com/office/word/2016/wordml/cid" xmlns:w16="http://schemas.microsoft.com/office/word/2018/wordml" xmlns:w16du="http://schemas.microsoft.com/office/word/2023/wordml/word16du" xmlns:w16sdtdh="http://schemas.microsoft.com/office/word/2020/wordml/sdtdatahash" xmlns:w16sdtfl="http://schemas.microsoft.com/office/word/2024/wordml/sdtformatlock" xmlns:w16se="http://schemas.microsoft.com/office/word/2015/wordml/symex" xmlns:wpg="http://schemas.microsoft.com/office/word/2010/wordprocessingGroup" xmlns:wpi="http://schemas.microsoft.com/office/word/2010/wordprocessingInk" xmlns:wne="http://schemas.microsoft.com/office/word/2006/wordml" xmlns:wps="http://schemas.microsoft.com/office/word/2010/wordprocessingShape" mc:Ignorable="w14 w15 w16se w16cid w16 w16cex w16sdtdh w16sdtfl w16du wp14">
+  <w:abstractNum w:abstractNumId="0" w15:restartNumberingAfterBreak="0">
+    <w:nsid w:val="4BAB2E6E"/>
+    <w:multiLevelType w:val="hybridMultilevel"/>
+    <w:tmpl w:val="02689AEE"/>
+    <w:lvl w:ilvl="0" w:tplc="100A0001">
+      <w:start w:val="1"/>
+      <w:numFmt w:val="bullet"/>
+      <w:lvlText w:val=""/>
+      <w:lvlJc w:val="left"/>
+      <w:pPr>
+        <w:ind w:left="720" w:hanging="360"/>
+      </w:pPr>
+      <w:rPr>
+        <w:rFonts w:ascii="Symbol" w:hAnsi="Symbol" w:hint="default"/>
+      </w:rPr>
+    </w:lvl>
+    <w:lvl w:ilvl="1" w:tplc="100A0003" w:tentative="1">
+      <w:start w:val="1"/>
+      <w:numFmt w:val="bullet"/>
+      <w:lvlText w:val="o"/>
+      <w:lvlJc w:val="left"/>
+      <w:pPr>
+        <w:ind w:left="1440" w:hanging="360"/>
+      </w:pPr>
+      <w:rPr>
+        <w:rFonts w:ascii="Courier New" w:hAnsi="Courier New" w:cs="Courier New" w:hint="default"/>
+      </w:rPr>
+    </w:lvl>
+    <w:lvl w:ilvl="2" w:tplc="100A0005" w:tentative="1">
+      <w:start w:val="1"/>
+      <w:numFmt w:val="bullet"/>
+      <w:lvlText w:val=""/>
+      <w:lvlJc w:val="left"/>
+      <w:pPr>
+        <w:ind w:left="2160" w:hanging="360"/>
+      </w:pPr>
+      <w:rPr>
+        <w:rFonts w:ascii="Wingdings" w:hAnsi="Wingdings" w:hint="default"/>
+      </w:rPr>
+    </w:lvl>
+    <w:lvl w:ilvl="3" w:tplc="100A0001" w:tentative="1">
+      <w:start w:val="1"/>
+      <w:numFmt w:val="bullet"/>
+      <w:lvlText w:val=""/>
+      <w:lvlJc w:val="left"/>
+      <w:pPr>
+        <w:ind w:left="2880" w:hanging="360"/>
+      </w:pPr>
+      <w:rPr>
+        <w:rFonts w:ascii="Symbol" w:hAnsi="Symbol" w:hint="default"/>
+      </w:rPr>
+    </w:lvl>
+    <w:lvl w:ilvl="4" w:tplc="100A0003" w:tentative="1">
+      <w:start w:val="1"/>
+      <w:numFmt w:val="bullet"/>
+      <w:lvlText w:val="o"/>
+      <w:lvlJc w:val="left"/>
+      <w:pPr>
+        <w:ind w:left="3600" w:hanging="360"/>
+      </w:pPr>
+      <w:rPr>
+        <w:rFonts w:ascii="Courier New" w:hAnsi="Courier New" w:cs="Courier New" w:hint="default"/>
+      </w:rPr>
+    </w:lvl>
+    <w:lvl w:ilvl="5" w:tplc="100A0005" w:tentative="1">
+      <w:start w:val="1"/>
+      <w:numFmt w:val="bullet"/>
+      <w:lvlText w:val=""/>
+      <w:lvlJc w:val="left"/>
+      <w:pPr>
+        <w:ind w:left="4320" w:hanging="360"/>
+      </w:pPr>
+      <w:rPr>
+        <w:rFonts w:ascii="Wingdings" w:hAnsi="Wingdings" w:hint="default"/>
+      </w:rPr>
+    </w:lvl>
+    <w:lvl w:ilvl="6" w:tplc="100A0001" w:tentative="1">
+      <w:start w:val="1"/>
+      <w:numFmt w:val="bullet"/>
+      <w:lvlText w:val=""/>
+      <w:lvlJc w:val="left"/>
+      <w:pPr>
+        <w:ind w:left="5040" w:hanging="360"/>
+      </w:pPr>
+      <w:rPr>
+        <w:rFonts w:ascii="Symbol" w:hAnsi="Symbol" w:hint="default"/>
+      </w:rPr>
+    </w:lvl>
+    <w:lvl w:ilvl="7" w:tplc="100A0003" w:tentative="1">
+      <w:start w:val="1"/>
+      <w:numFmt w:val="bullet"/>
+      <w:lvlText w:val="o"/>
+      <w:lvlJc w:val="left"/>
+      <w:pPr>
+        <w:ind w:left="5760" w:hanging="360"/>
+      </w:pPr>
+      <w:rPr>
+        <w:rFonts w:ascii="Courier New" w:hAnsi="Courier New" w:cs="Courier New" w:hint="default"/>
+      </w:rPr>
+    </w:lvl>
+    <w:lvl w:ilvl="8" w:tplc="100A0005" w:tentative="1">
+      <w:start w:val="1"/>
+      <w:numFmt w:val="bullet"/>
+      <w:lvlText w:val=""/>
+      <w:lvlJc w:val="left"/>
+      <w:pPr>
+        <w:ind w:left="6480" w:hanging="360"/>
+      </w:pPr>
+      <w:rPr>
+        <w:rFonts w:ascii="Wingdings" w:hAnsi="Wingdings" w:hint="default"/>
+      </w:rPr>
+    </w:lvl>
+  </w:abstractNum>
+  <w:num w:numId="1" w16cid:durableId="1115438786">
+    <w:abstractNumId w:val="0"/>
+  </w:num>
+</w:numbering>
 </file>
 
 <file path=word/styles.xml><?xml version="1.0" encoding="utf-8"?>
@@ -1420,6 +2999,177 @@
       <w:spacing w:val="5"/>
     </w:rPr>
   </w:style>
+  <w:style w:type="table" w:styleId="Tablaconcuadrcula">
+    <w:name w:val="Table Grid"/>
+    <w:basedOn w:val="Tablanormal"/>
+    <w:uiPriority w:val="39"/>
+    <w:rsid w:val="002916D5"/>
+    <w:pPr>
+      <w:spacing w:after="0" w:line="240" w:lineRule="auto"/>
+    </w:pPr>
+    <w:tblPr>
+      <w:tblBorders>
+        <w:top w:val="single" w:sz="4" w:space="0" w:color="auto"/>
+        <w:left w:val="single" w:sz="4" w:space="0" w:color="auto"/>
+        <w:bottom w:val="single" w:sz="4" w:space="0" w:color="auto"/>
+        <w:right w:val="single" w:sz="4" w:space="0" w:color="auto"/>
+        <w:insideH w:val="single" w:sz="4" w:space="0" w:color="auto"/>
+        <w:insideV w:val="single" w:sz="4" w:space="0" w:color="auto"/>
+      </w:tblBorders>
+    </w:tblPr>
+  </w:style>
+  <w:style w:type="table" w:styleId="Tablaconcuadrcula4-nfasis3">
+    <w:name w:val="Grid Table 4 Accent 3"/>
+    <w:basedOn w:val="Tablanormal"/>
+    <w:uiPriority w:val="49"/>
+    <w:rsid w:val="002916D5"/>
+    <w:pPr>
+      <w:spacing w:after="0" w:line="240" w:lineRule="auto"/>
+    </w:pPr>
+    <w:tblPr>
+      <w:tblStyleRowBandSize w:val="1"/>
+      <w:tblStyleColBandSize w:val="1"/>
+      <w:tblBorders>
+        <w:top w:val="single" w:sz="4" w:space="0" w:color="47D459" w:themeColor="accent3" w:themeTint="99"/>
+        <w:left w:val="single" w:sz="4" w:space="0" w:color="47D459" w:themeColor="accent3" w:themeTint="99"/>
+        <w:bottom w:val="single" w:sz="4" w:space="0" w:color="47D459" w:themeColor="accent3" w:themeTint="99"/>
+        <w:right w:val="single" w:sz="4" w:space="0" w:color="47D459" w:themeColor="accent3" w:themeTint="99"/>
+        <w:insideH w:val="single" w:sz="4" w:space="0" w:color="47D459" w:themeColor="accent3" w:themeTint="99"/>
+        <w:insideV w:val="single" w:sz="4" w:space="0" w:color="47D459" w:themeColor="accent3" w:themeTint="99"/>
+      </w:tblBorders>
+    </w:tblPr>
+    <w:tblStylePr w:type="firstRow">
+      <w:rPr>
+        <w:b/>
+        <w:bCs/>
+        <w:color w:val="FFFFFF" w:themeColor="background1"/>
+      </w:rPr>
+      <w:tblPr/>
+      <w:tcPr>
+        <w:tcBorders>
+          <w:top w:val="single" w:sz="4" w:space="0" w:color="196B24" w:themeColor="accent3"/>
+          <w:left w:val="single" w:sz="4" w:space="0" w:color="196B24" w:themeColor="accent3"/>
+          <w:bottom w:val="single" w:sz="4" w:space="0" w:color="196B24" w:themeColor="accent3"/>
+          <w:right w:val="single" w:sz="4" w:space="0" w:color="196B24" w:themeColor="accent3"/>
+          <w:insideH w:val="nil"/>
+          <w:insideV w:val="nil"/>
+        </w:tcBorders>
+        <w:shd w:val="clear" w:color="auto" w:fill="196B24" w:themeFill="accent3"/>
+      </w:tcPr>
+    </w:tblStylePr>
+    <w:tblStylePr w:type="lastRow">
+      <w:rPr>
+        <w:b/>
+        <w:bCs/>
+      </w:rPr>
+      <w:tblPr/>
+      <w:tcPr>
+        <w:tcBorders>
+          <w:top w:val="double" w:sz="4" w:space="0" w:color="196B24" w:themeColor="accent3"/>
+        </w:tcBorders>
+      </w:tcPr>
+    </w:tblStylePr>
+    <w:tblStylePr w:type="firstCol">
+      <w:rPr>
+        <w:b/>
+        <w:bCs/>
+      </w:rPr>
+    </w:tblStylePr>
+    <w:tblStylePr w:type="lastCol">
+      <w:rPr>
+        <w:b/>
+        <w:bCs/>
+      </w:rPr>
+    </w:tblStylePr>
+    <w:tblStylePr w:type="band1Vert">
+      <w:tblPr/>
+      <w:tcPr>
+        <w:shd w:val="clear" w:color="auto" w:fill="C1F0C7" w:themeFill="accent3" w:themeFillTint="33"/>
+      </w:tcPr>
+    </w:tblStylePr>
+    <w:tblStylePr w:type="band1Horz">
+      <w:tblPr/>
+      <w:tcPr>
+        <w:shd w:val="clear" w:color="auto" w:fill="C1F0C7" w:themeFill="accent3" w:themeFillTint="33"/>
+      </w:tcPr>
+    </w:tblStylePr>
+  </w:style>
+  <w:style w:type="table" w:styleId="Tablaconcuadrcula4-nfasis4">
+    <w:name w:val="Grid Table 4 Accent 4"/>
+    <w:basedOn w:val="Tablanormal"/>
+    <w:uiPriority w:val="49"/>
+    <w:rsid w:val="002916D5"/>
+    <w:pPr>
+      <w:spacing w:after="0" w:line="240" w:lineRule="auto"/>
+    </w:pPr>
+    <w:tblPr>
+      <w:tblStyleRowBandSize w:val="1"/>
+      <w:tblStyleColBandSize w:val="1"/>
+      <w:tblBorders>
+        <w:top w:val="single" w:sz="4" w:space="0" w:color="60CAF3" w:themeColor="accent4" w:themeTint="99"/>
+        <w:left w:val="single" w:sz="4" w:space="0" w:color="60CAF3" w:themeColor="accent4" w:themeTint="99"/>
+        <w:bottom w:val="single" w:sz="4" w:space="0" w:color="60CAF3" w:themeColor="accent4" w:themeTint="99"/>
+        <w:right w:val="single" w:sz="4" w:space="0" w:color="60CAF3" w:themeColor="accent4" w:themeTint="99"/>
+        <w:insideH w:val="single" w:sz="4" w:space="0" w:color="60CAF3" w:themeColor="accent4" w:themeTint="99"/>
+        <w:insideV w:val="single" w:sz="4" w:space="0" w:color="60CAF3" w:themeColor="accent4" w:themeTint="99"/>
+      </w:tblBorders>
+    </w:tblPr>
+    <w:tblStylePr w:type="firstRow">
+      <w:rPr>
+        <w:b/>
+        <w:bCs/>
+        <w:color w:val="FFFFFF" w:themeColor="background1"/>
+      </w:rPr>
+      <w:tblPr/>
+      <w:tcPr>
+        <w:tcBorders>
+          <w:top w:val="single" w:sz="4" w:space="0" w:color="0F9ED5" w:themeColor="accent4"/>
+          <w:left w:val="single" w:sz="4" w:space="0" w:color="0F9ED5" w:themeColor="accent4"/>
+          <w:bottom w:val="single" w:sz="4" w:space="0" w:color="0F9ED5" w:themeColor="accent4"/>
+          <w:right w:val="single" w:sz="4" w:space="0" w:color="0F9ED5" w:themeColor="accent4"/>
+          <w:insideH w:val="nil"/>
+          <w:insideV w:val="nil"/>
+        </w:tcBorders>
+        <w:shd w:val="clear" w:color="auto" w:fill="0F9ED5" w:themeFill="accent4"/>
+      </w:tcPr>
+    </w:tblStylePr>
+    <w:tblStylePr w:type="lastRow">
+      <w:rPr>
+        <w:b/>
+        <w:bCs/>
+      </w:rPr>
+      <w:tblPr/>
+      <w:tcPr>
+        <w:tcBorders>
+          <w:top w:val="double" w:sz="4" w:space="0" w:color="0F9ED5" w:themeColor="accent4"/>
+        </w:tcBorders>
+      </w:tcPr>
+    </w:tblStylePr>
+    <w:tblStylePr w:type="firstCol">
+      <w:rPr>
+        <w:b/>
+        <w:bCs/>
+      </w:rPr>
+    </w:tblStylePr>
+    <w:tblStylePr w:type="lastCol">
+      <w:rPr>
+        <w:b/>
+        <w:bCs/>
+      </w:rPr>
+    </w:tblStylePr>
+    <w:tblStylePr w:type="band1Vert">
+      <w:tblPr/>
+      <w:tcPr>
+        <w:shd w:val="clear" w:color="auto" w:fill="CAEDFB" w:themeFill="accent4" w:themeFillTint="33"/>
+      </w:tcPr>
+    </w:tblStylePr>
+    <w:tblStylePr w:type="band1Horz">
+      <w:tblPr/>
+      <w:tcPr>
+        <w:shd w:val="clear" w:color="auto" w:fill="CAEDFB" w:themeFill="accent4" w:themeFillTint="33"/>
+      </w:tcPr>
+    </w:tblStylePr>
+  </w:style>
 </w:styles>
 </file>
 

</xml_diff>